<commit_message>
Verbeter Eqraft-formulier en geef handtekeningen extra ruimte
</commit_message>
<xml_diff>
--- a/templates/Aanwijzing_NEN3140.docx
+++ b/templates/Aanwijzing_NEN3140.docx
@@ -1052,7 +1052,7 @@
           </w:p>
           <w:p>
             <w:pPr>
-              <w:spacing w:before="160"/>
+              <w:spacing w:before="1040" w:after="160"/>
             </w:pPr>
             <w:r>
               <w:rPr>
@@ -1160,7 +1160,7 @@
           </w:p>
           <w:p>
             <w:pPr>
-              <w:spacing w:before="160"/>
+              <w:spacing w:before="1040" w:after="160"/>
             </w:pPr>
             <w:r>
               <w:rPr>

</xml_diff>

<commit_message>
Voeg aanwijzingsmodel, codekeuzes en eigen catalogus toe
</commit_message>
<xml_diff>
--- a/templates/Aanwijzing_NEN3140.docx
+++ b/templates/Aanwijzing_NEN3140.docx
@@ -645,6 +645,73 @@
         </w:tc>
       </w:tr>
     </w:tbl>
+    <w:tbl>
+      <w:tblPr>
+        <w:tblW w:type="auto" w:w="0"/>
+        <w:jc w:val="center"/>
+        <w:tblLayout w:type="fixed"/>
+        <w:tblLook w:firstColumn="1" w:firstRow="1" w:lastColumn="0" w:lastRow="0" w:noHBand="0" w:noVBand="1" w:val="04A0"/>
+      </w:tblPr>
+      <w:tblGrid>
+        <w:gridCol w:w="2835"/>
+        <w:gridCol w:w="6803"/>
+      </w:tblGrid>
+      <w:tr>
+        <w:trPr>
+          <w:cantSplit/>
+        </w:trPr>
+        <w:tc>
+          <w:tcPr>
+            <w:tcW w:type="dxa" w:w="4819"/>
+            <w:tcMar>
+              <w:top w:w="45" w:type="dxa"/>
+              <w:start w:w="0" w:type="dxa"/>
+              <w:bottom w:w="45" w:type="dxa"/>
+              <w:end w:w="80" w:type="dxa"/>
+            </w:tcMar>
+            <w:tcBorders>
+              <w:bottom w:val="single" w:sz="5" w:color="E7E7E7"/>
+            </w:tcBorders>
+          </w:tcPr>
+          <w:p>
+            <w:r>
+              <w:rPr>
+                <w:rFonts w:ascii="Arial" w:hAnsi="Arial"/>
+                <w:b/>
+                <w:color w:val="141414"/>
+                <w:sz w:val="18"/>
+              </w:rPr>
+              <w:t>Toepasselijke procedures</w:t>
+            </w:r>
+          </w:p>
+        </w:tc>
+        <w:tc>
+          <w:tcPr>
+            <w:tcW w:type="dxa" w:w="4819"/>
+            <w:tcMar>
+              <w:top w:w="45" w:type="dxa"/>
+              <w:start w:w="80" w:type="dxa"/>
+              <w:bottom w:w="45" w:type="dxa"/>
+              <w:end w:w="0" w:type="dxa"/>
+            </w:tcMar>
+            <w:tcBorders>
+              <w:bottom w:val="single" w:sz="5" w:color="E7E7E7"/>
+            </w:tcBorders>
+          </w:tcPr>
+          <w:p>
+            <w:r>
+              <w:rPr>
+                <w:rFonts w:ascii="Arial" w:hAnsi="Arial"/>
+                <w:b w:val="0"/>
+                <w:color w:val="141414"/>
+                <w:sz w:val="19"/>
+              </w:rPr>
+              <w:t>{{PROCEDURES}}</w:t>
+            </w:r>
+          </w:p>
+        </w:tc>
+      </w:tr>
+    </w:tbl>
     <w:p>
       <w:pPr>
         <w:keepNext/>
@@ -808,6 +875,73 @@
                 <w:sz w:val="19"/>
               </w:rPr>
               <w:t>{{BEVOEGDHEDEN}}</w:t>
+            </w:r>
+          </w:p>
+        </w:tc>
+      </w:tr>
+    </w:tbl>
+    <w:tbl>
+      <w:tblPr>
+        <w:tblW w:type="auto" w:w="0"/>
+        <w:jc w:val="center"/>
+        <w:tblLayout w:type="fixed"/>
+        <w:tblLook w:firstColumn="1" w:firstRow="1" w:lastColumn="0" w:lastRow="0" w:noHBand="0" w:noVBand="1" w:val="04A0"/>
+      </w:tblPr>
+      <w:tblGrid>
+        <w:gridCol w:w="2835"/>
+        <w:gridCol w:w="6803"/>
+      </w:tblGrid>
+      <w:tr>
+        <w:trPr>
+          <w:cantSplit/>
+        </w:trPr>
+        <w:tc>
+          <w:tcPr>
+            <w:tcW w:type="dxa" w:w="4819"/>
+            <w:tcMar>
+              <w:top w:w="45" w:type="dxa"/>
+              <w:start w:w="0" w:type="dxa"/>
+              <w:bottom w:w="45" w:type="dxa"/>
+              <w:end w:w="80" w:type="dxa"/>
+            </w:tcMar>
+            <w:tcBorders>
+              <w:bottom w:val="single" w:sz="5" w:color="E7E7E7"/>
+            </w:tcBorders>
+          </w:tcPr>
+          <w:p>
+            <w:r>
+              <w:rPr>
+                <w:rFonts w:ascii="Arial" w:hAnsi="Arial"/>
+                <w:b/>
+                <w:color w:val="141414"/>
+                <w:sz w:val="18"/>
+              </w:rPr>
+              <w:t>Persoonsgebonden bevoegdheidsregels</w:t>
+            </w:r>
+          </w:p>
+        </w:tc>
+        <w:tc>
+          <w:tcPr>
+            <w:tcW w:type="dxa" w:w="4819"/>
+            <w:tcMar>
+              <w:top w:w="45" w:type="dxa"/>
+              <w:start w:w="80" w:type="dxa"/>
+              <w:bottom w:w="45" w:type="dxa"/>
+              <w:end w:w="0" w:type="dxa"/>
+            </w:tcMar>
+            <w:tcBorders>
+              <w:bottom w:val="single" w:sz="5" w:color="E7E7E7"/>
+            </w:tcBorders>
+          </w:tcPr>
+          <w:p>
+            <w:r>
+              <w:rPr>
+                <w:rFonts w:ascii="Arial" w:hAnsi="Arial"/>
+                <w:b w:val="0"/>
+                <w:color w:val="141414"/>
+                <w:sz w:val="19"/>
+              </w:rPr>
+              <w:t>{{COMBINATIES}}</w:t>
             </w:r>
           </w:p>
         </w:tc>

</xml_diff>